<commit_message>
docs: generalize migration checklist guide
</commit_message>
<xml_diff>
--- a/Guia checklist migracion originales a formato nuevo.docx
+++ b/Guia checklist migracion originales a formato nuevo.docx
@@ -7,7 +7,7 @@
         <w:pStyle w:val="Title"/>
       </w:pPr>
       <w:r>
-        <w:t>Guía y checklist de migración de procedimientos IPQ al formato nuevo</w:t>
+        <w:t>Guía y checklist general de migración de procedimientos al formato nuevo</w:t>
       </w:r>
     </w:p>
     <w:p>
@@ -15,7 +15,7 @@
         <w:pStyle w:val="Subtitle"/>
       </w:pPr>
       <w:r>
-        <w:t>Uso: migrar el contenido del archivo original al template nuevo sin omitir información, referencias ni controles.</w:t>
+        <w:t>Documento de uso general para toda la empresa.</w:t>
       </w:r>
     </w:p>
     <w:p/>
@@ -29,17 +29,17 @@
     </w:p>
     <w:p>
       <w:r>
-        <w:t>Esta guía define un método paso a paso para copiar y adaptar un procedimiento original al formato nuevo estandarizado.</w:t>
+        <w:t>Esta guía define un método general, uniforme y controlable para migrar cualquier procedimiento de la empresa desde un formato anterior al formato documental nuevo estandarizado.</w:t>
       </w:r>
     </w:p>
     <w:p>
       <w:r>
-        <w:t>El objetivo es evitar pérdidas de información, omisión de formularios, cambios de alcance no deseados y errores de estructura.</w:t>
+        <w:t>Su finalidad es asegurar que durante la migración no se omitan pasos, referencias, formularios, responsabilidades, criterios de control, anexos ni información técnica relevante.</w:t>
       </w:r>
     </w:p>
     <w:p>
       <w:r>
-        <w:t>Debe usarse como planilla de control durante cada migración documental.</w:t>
+        <w:t>Debe utilizarse como planilla operativa y checklist de validación para toda migración de procedimientos, instructivos o documentos equivalentes.</w:t>
       </w:r>
     </w:p>
     <w:p/>
@@ -48,22 +48,41 @@
         <w:pStyle w:val="Heading1"/>
       </w:pPr>
       <w:r>
-        <w:t>2. Regla principal de migración</w:t>
+        <w:t>2. Alcance de aplicación de la guía</w:t>
       </w:r>
     </w:p>
     <w:p>
       <w:r>
-        <w:t>El archivo revisado no debe ser una reescritura libre. Debe conservar íntegramente el contenido operativo del original y, además, acomodarlo a la nueva estructura documental.</w:t>
+        <w:t>Aplica a todos los procedimientos, instrucciones, normas internas, documentos operativos y registros documentales que deban migrarse al formato corporativo nuevo.</w:t>
       </w:r>
     </w:p>
     <w:p>
       <w:r>
-        <w:t>Toda información del original debe quedar en alguna sección del nuevo formato, aun cuando cambie de ubicación o redacción.</w:t>
+        <w:t>Aplica tanto cuando el documento original esté en formato Word antiguo, Word moderno, PDF editable o cualquier otro formato fuente autorizado dentro de la empresa.</w:t>
+      </w:r>
+    </w:p>
+    <w:p/>
+    <w:p>
+      <w:pPr>
+        <w:pStyle w:val="Heading1"/>
+      </w:pPr>
+      <w:r>
+        <w:t>3. Principio rector de migración</w:t>
       </w:r>
     </w:p>
     <w:p>
       <w:r>
-        <w:t>Si el template nuevo tiene secciones que el original no tenía explícitamente, deben completarse a partir del contenido implícito del original o dejarse justificadas como “No aplica”, nunca omitirse en silencio.</w:t>
+        <w:t>La migración no debe ser una reescritura libre ni una simplificación del documento original.</w:t>
+      </w:r>
+    </w:p>
+    <w:p>
+      <w:r>
+        <w:t>Todo contenido técnico, operativo, normativo o documental del archivo original debe preservarse y quedar correctamente ubicado dentro de la nueva estructura.</w:t>
+      </w:r>
+    </w:p>
+    <w:p>
+      <w:r>
+        <w:t>Si el formato nuevo exige apartados que el original no tenía explícitamente, esos apartados deben completarse usando la información implícita del documento fuente, criterios documentales consistentes y validación técnica interna. Nunca deben omitirse silenciosamente.</w:t>
       </w:r>
     </w:p>
     <w:p/>
@@ -72,7 +91,7 @@
         <w:pStyle w:val="Heading1"/>
       </w:pPr>
       <w:r>
-        <w:t>3. Checklist de preparación previa</w:t>
+        <w:t>4. Preparación previa obligatoria</w:t>
       </w:r>
     </w:p>
     <w:p>
@@ -80,7 +99,7 @@
         <w:pStyle w:val="ListParagraph"/>
       </w:pPr>
       <w:r>
-        <w:t>☐ Identificar código IPQ, título, revisión y edición del original.</w:t>
+        <w:t>☐ Identificar código, título, revisión, edición y estado vigente del documento original.</w:t>
       </w:r>
     </w:p>
     <w:p>
@@ -88,7 +107,7 @@
         <w:pStyle w:val="ListParagraph"/>
       </w:pPr>
       <w:r>
-        <w:t>☐ Identificar nombre del archivo revisado/template destino.</w:t>
+        <w:t>☐ Verificar que el archivo fuente sea la última versión aprobada o la versión autorizada para migrar.</w:t>
       </w:r>
     </w:p>
     <w:p>
@@ -96,7 +115,7 @@
         <w:pStyle w:val="ListParagraph"/>
       </w:pPr>
       <w:r>
-        <w:t>☐ Confirmar que ambos archivos corresponden al mismo procedimiento.</w:t>
+        <w:t>☐ Confirmar cuál es el template nuevo aprobado por la empresa para usar como destino.</w:t>
       </w:r>
     </w:p>
     <w:p>
@@ -104,7 +123,7 @@
         <w:pStyle w:val="ListParagraph"/>
       </w:pPr>
       <w:r>
-        <w:t>☐ Extraer del original: título, objetivo, alcance/área de aplicación, metodología, referencias, formularios, historial de revisiones, aprobaciones, anexos, diagramas e imágenes.</w:t>
+        <w:t>☐ Crear copia de trabajo del template antes de comenzar la edición.</w:t>
       </w:r>
     </w:p>
     <w:p>
@@ -112,7 +131,7 @@
         <w:pStyle w:val="ListParagraph"/>
       </w:pPr>
       <w:r>
-        <w:t>☐ Crear una copia de trabajo del template nuevo antes de empezar a editar.</w:t>
+        <w:t>☐ Relevar del original todo el contenido textual, tablas, formularios, referencias, gráficos, diagramas, firmas, responsables y notas asociadas.</w:t>
       </w:r>
     </w:p>
     <w:p>
@@ -120,7 +139,7 @@
         <w:pStyle w:val="ListParagraph"/>
       </w:pPr>
       <w:r>
-        <w:t>☐ Registrar responsable de la migración y fecha de trabajo.</w:t>
+        <w:t>☐ Registrar responsable de la migración, fecha y documento intervenido.</w:t>
       </w:r>
     </w:p>
     <w:p/>
@@ -129,7 +148,7 @@
         <w:pStyle w:val="Heading1"/>
       </w:pPr>
       <w:r>
-        <w:t>4. Mapeo obligatorio: sección original → sección nueva</w:t>
+        <w:t>5. Mapeo general: contenido del original hacia el formato nuevo</w:t>
       </w:r>
     </w:p>
     <w:tbl>
@@ -146,9 +165,9 @@
         </w:tblBorders>
       </w:tblPr>
       <w:tblGrid>
-        <w:gridCol w:w="3500"/>
-        <w:gridCol w:w="3000"/>
-        <w:gridCol w:w="5500"/>
+        <w:gridCol w:w="4200"/>
+        <w:gridCol w:w="3200"/>
+        <w:gridCol w:w="4600"/>
       </w:tblGrid>
       <w:tr>
         <w:tc>
@@ -160,7 +179,7 @@
               <w:rPr>
                 <w:b/>
               </w:rPr>
-              <w:t>Contenido en original</w:t>
+              <w:t>Contenido ubicado en el original</w:t>
             </w:r>
           </w:p>
         </w:tc>
@@ -198,7 +217,7 @@
           </w:tcPr>
           <w:p>
             <w:r>
-              <w:t>Título / encabezado del original</w:t>
+              <w:t>Título / encabezado / identificación</w:t>
             </w:r>
           </w:p>
         </w:tc>
@@ -208,7 +227,7 @@
           </w:tcPr>
           <w:p>
             <w:r>
-              <w:t>Identificación + título del nuevo</w:t>
+              <w:t>Identificación general del documento</w:t>
             </w:r>
           </w:p>
         </w:tc>
@@ -218,7 +237,7 @@
           </w:tcPr>
           <w:p>
             <w:r>
-              <w:t>Copiar el nombre funcional exacto. Ajustar solo estilo/acentos, no cambiar el sentido.</w:t>
+              <w:t>Conservar denominación funcional, código y datos de versión.</w:t>
             </w:r>
           </w:p>
         </w:tc>
@@ -230,7 +249,263 @@
           </w:tcPr>
           <w:p>
             <w:r>
-              <w:t>Registro de revisiones</w:t>
+              <w:t>Objeto o finalidad implícita</w:t>
+            </w:r>
+          </w:p>
+        </w:tc>
+        <w:tc>
+          <w:tcPr>
+            <w:tcW w:w="0" w:type="auto"/>
+          </w:tcPr>
+          <w:p>
+            <w:r>
+              <w:t>1. Objetivo</w:t>
+            </w:r>
+          </w:p>
+        </w:tc>
+        <w:tc>
+          <w:tcPr>
+            <w:tcW w:w="0" w:type="auto"/>
+          </w:tcPr>
+          <w:p>
+            <w:r>
+              <w:t>Formalizar el propósito técnico del procedimiento sin cambiar su sentido.</w:t>
+            </w:r>
+          </w:p>
+        </w:tc>
+      </w:tr>
+      <w:tr>
+        <w:tc>
+          <w:tcPr>
+            <w:tcW w:w="0" w:type="auto"/>
+          </w:tcPr>
+          <w:p>
+            <w:r>
+              <w:t>Área de aplicación / universo afectado</w:t>
+            </w:r>
+          </w:p>
+        </w:tc>
+        <w:tc>
+          <w:tcPr>
+            <w:tcW w:w="0" w:type="auto"/>
+          </w:tcPr>
+          <w:p>
+            <w:r>
+              <w:t>2. Alcance</w:t>
+            </w:r>
+          </w:p>
+        </w:tc>
+        <w:tc>
+          <w:tcPr>
+            <w:tcW w:w="0" w:type="auto"/>
+          </w:tcPr>
+          <w:p>
+            <w:r>
+              <w:t>Trasladar el alcance completo, incluyendo límites, exclusiones y casos particulares.</w:t>
+            </w:r>
+          </w:p>
+        </w:tc>
+      </w:tr>
+      <w:tr>
+        <w:tc>
+          <w:tcPr>
+            <w:tcW w:w="0" w:type="auto"/>
+          </w:tcPr>
+          <w:p>
+            <w:r>
+              <w:t>Definiciones dispersas o siglas usadas</w:t>
+            </w:r>
+          </w:p>
+        </w:tc>
+        <w:tc>
+          <w:tcPr>
+            <w:tcW w:w="0" w:type="auto"/>
+          </w:tcPr>
+          <w:p>
+            <w:r>
+              <w:t>3. Definiciones y abreviaturas</w:t>
+            </w:r>
+          </w:p>
+        </w:tc>
+        <w:tc>
+          <w:tcPr>
+            <w:tcW w:w="0" w:type="auto"/>
+          </w:tcPr>
+          <w:p>
+            <w:r>
+              <w:t>Reunir y normalizar terminología necesaria para comprensión y trazabilidad.</w:t>
+            </w:r>
+          </w:p>
+        </w:tc>
+      </w:tr>
+      <w:tr>
+        <w:tc>
+          <w:tcPr>
+            <w:tcW w:w="0" w:type="auto"/>
+          </w:tcPr>
+          <w:p>
+            <w:r>
+              <w:t>Metodología / instrucciones / operatoria</w:t>
+            </w:r>
+          </w:p>
+        </w:tc>
+        <w:tc>
+          <w:tcPr>
+            <w:tcW w:w="0" w:type="auto"/>
+          </w:tcPr>
+          <w:p>
+            <w:r>
+              <w:t>4. Desarrollo</w:t>
+            </w:r>
+          </w:p>
+        </w:tc>
+        <w:tc>
+          <w:tcPr>
+            <w:tcW w:w="0" w:type="auto"/>
+          </w:tcPr>
+          <w:p>
+            <w:r>
+              <w:t>Migrar todos los pasos, secuencias, decisiones, validaciones y controles.</w:t>
+            </w:r>
+          </w:p>
+        </w:tc>
+      </w:tr>
+      <w:tr>
+        <w:tc>
+          <w:tcPr>
+            <w:tcW w:w="0" w:type="auto"/>
+          </w:tcPr>
+          <w:p>
+            <w:r>
+              <w:t>Firmas / sectores / actores intervinientes</w:t>
+            </w:r>
+          </w:p>
+        </w:tc>
+        <w:tc>
+          <w:tcPr>
+            <w:tcW w:w="0" w:type="auto"/>
+          </w:tcPr>
+          <w:p>
+            <w:r>
+              <w:t>5. Responsabilidades</w:t>
+            </w:r>
+          </w:p>
+        </w:tc>
+        <w:tc>
+          <w:tcPr>
+            <w:tcW w:w="0" w:type="auto"/>
+          </w:tcPr>
+          <w:p>
+            <w:r>
+              <w:t>Convertir participantes y roles del original en responsabilidades explícitas.</w:t>
+            </w:r>
+          </w:p>
+        </w:tc>
+      </w:tr>
+      <w:tr>
+        <w:tc>
+          <w:tcPr>
+            <w:tcW w:w="0" w:type="auto"/>
+          </w:tcPr>
+          <w:p>
+            <w:r>
+              <w:t>Advertencias / puntos de control / riesgos implícitos</w:t>
+            </w:r>
+          </w:p>
+        </w:tc>
+        <w:tc>
+          <w:tcPr>
+            <w:tcW w:w="0" w:type="auto"/>
+          </w:tcPr>
+          <w:p>
+            <w:r>
+              <w:t>6. Riesgos y controles asociados</w:t>
+            </w:r>
+          </w:p>
+        </w:tc>
+        <w:tc>
+          <w:tcPr>
+            <w:tcW w:w="0" w:type="auto"/>
+          </w:tcPr>
+          <w:p>
+            <w:r>
+              <w:t>Explicitar qué riesgo existe y qué control lo previene o detecta.</w:t>
+            </w:r>
+          </w:p>
+        </w:tc>
+      </w:tr>
+      <w:tr>
+        <w:tc>
+          <w:tcPr>
+            <w:tcW w:w="0" w:type="auto"/>
+          </w:tcPr>
+          <w:p>
+            <w:r>
+              <w:t>Procedimientos, formularios, normas, registros relacionados</w:t>
+            </w:r>
+          </w:p>
+        </w:tc>
+        <w:tc>
+          <w:tcPr>
+            <w:tcW w:w="0" w:type="auto"/>
+          </w:tcPr>
+          <w:p>
+            <w:r>
+              <w:t>7. Documentos relacionados</w:t>
+            </w:r>
+          </w:p>
+        </w:tc>
+        <w:tc>
+          <w:tcPr>
+            <w:tcW w:w="0" w:type="auto"/>
+          </w:tcPr>
+          <w:p>
+            <w:r>
+              <w:t>Copiar todos los documentos citados con sus códigos y nombres correctos.</w:t>
+            </w:r>
+          </w:p>
+        </w:tc>
+      </w:tr>
+      <w:tr>
+        <w:tc>
+          <w:tcPr>
+            <w:tcW w:w="0" w:type="auto"/>
+          </w:tcPr>
+          <w:p>
+            <w:r>
+              <w:t>Gráficos, flujos, tablas especiales, ejemplos, material de apoyo</w:t>
+            </w:r>
+          </w:p>
+        </w:tc>
+        <w:tc>
+          <w:tcPr>
+            <w:tcW w:w="0" w:type="auto"/>
+          </w:tcPr>
+          <w:p>
+            <w:r>
+              <w:t>8. Apéndices o anexos</w:t>
+            </w:r>
+          </w:p>
+        </w:tc>
+        <w:tc>
+          <w:tcPr>
+            <w:tcW w:w="0" w:type="auto"/>
+          </w:tcPr>
+          <w:p>
+            <w:r>
+              <w:t>Preservar material complementario o justificar su incorporación dentro del desarrollo.</w:t>
+            </w:r>
+          </w:p>
+        </w:tc>
+      </w:tr>
+      <w:tr>
+        <w:tc>
+          <w:tcPr>
+            <w:tcW w:w="0" w:type="auto"/>
+          </w:tcPr>
+          <w:p>
+            <w:r>
+              <w:t>Registro de revisiones / historial</w:t>
             </w:r>
           </w:p>
         </w:tc>
@@ -250,263 +525,7 @@
           </w:tcPr>
           <w:p>
             <w:r>
-              <w:t>Migrar todas las revisiones históricas. Si hubo cambios editoriales en la migración, agregarlos como nueva entrada.</w:t>
-            </w:r>
-          </w:p>
-        </w:tc>
-      </w:tr>
-      <w:tr>
-        <w:tc>
-          <w:tcPr>
-            <w:tcW w:w="0" w:type="auto"/>
-          </w:tcPr>
-          <w:p>
-            <w:r>
-              <w:t>Área de aplicación</w:t>
-            </w:r>
-          </w:p>
-        </w:tc>
-        <w:tc>
-          <w:tcPr>
-            <w:tcW w:w="0" w:type="auto"/>
-          </w:tcPr>
-          <w:p>
-            <w:r>
-              <w:t>2. Alcance</w:t>
-            </w:r>
-          </w:p>
-        </w:tc>
-        <w:tc>
-          <w:tcPr>
-            <w:tcW w:w="0" w:type="auto"/>
-          </w:tcPr>
-          <w:p>
-            <w:r>
-              <w:t>Copiar completo. No resumir si el original lista ejemplos, exclusiones o subconjuntos específicos.</w:t>
-            </w:r>
-          </w:p>
-        </w:tc>
-      </w:tr>
-      <w:tr>
-        <w:tc>
-          <w:tcPr>
-            <w:tcW w:w="0" w:type="auto"/>
-          </w:tcPr>
-          <w:p>
-            <w:r>
-              <w:t>Objetivo implícito en metodología o título</w:t>
-            </w:r>
-          </w:p>
-        </w:tc>
-        <w:tc>
-          <w:tcPr>
-            <w:tcW w:w="0" w:type="auto"/>
-          </w:tcPr>
-          <w:p>
-            <w:r>
-              <w:t>1. Objetivo</w:t>
-            </w:r>
-          </w:p>
-        </w:tc>
-        <w:tc>
-          <w:tcPr>
-            <w:tcW w:w="0" w:type="auto"/>
-          </w:tcPr>
-          <w:p>
-            <w:r>
-              <w:t>Redactar objetivo formal sin perder el propósito técnico original.</w:t>
-            </w:r>
-          </w:p>
-        </w:tc>
-      </w:tr>
-      <w:tr>
-        <w:tc>
-          <w:tcPr>
-            <w:tcW w:w="0" w:type="auto"/>
-          </w:tcPr>
-          <w:p>
-            <w:r>
-              <w:t>Metodología / desarrollo operativo</w:t>
-            </w:r>
-          </w:p>
-        </w:tc>
-        <w:tc>
-          <w:tcPr>
-            <w:tcW w:w="0" w:type="auto"/>
-          </w:tcPr>
-          <w:p>
-            <w:r>
-              <w:t>4. Desarrollo</w:t>
-            </w:r>
-          </w:p>
-        </w:tc>
-        <w:tc>
-          <w:tcPr>
-            <w:tcW w:w="0" w:type="auto"/>
-          </w:tcPr>
-          <w:p>
-            <w:r>
-              <w:t>Trasladar todos los pasos, decisiones, criterios y secuencias del original.</w:t>
-            </w:r>
-          </w:p>
-        </w:tc>
-      </w:tr>
-      <w:tr>
-        <w:tc>
-          <w:tcPr>
-            <w:tcW w:w="0" w:type="auto"/>
-          </w:tcPr>
-          <w:p>
-            <w:r>
-              <w:t>Formularios y/o registros asociados</w:t>
-            </w:r>
-          </w:p>
-        </w:tc>
-        <w:tc>
-          <w:tcPr>
-            <w:tcW w:w="0" w:type="auto"/>
-          </w:tcPr>
-          <w:p>
-            <w:r>
-              <w:t>7. Documentos relacionados</w:t>
-            </w:r>
-          </w:p>
-        </w:tc>
-        <w:tc>
-          <w:tcPr>
-            <w:tcW w:w="0" w:type="auto"/>
-          </w:tcPr>
-          <w:p>
-            <w:r>
-              <w:t>Copiar todos los códigos y nombres exactos. Verificar que no falte ninguno.</w:t>
-            </w:r>
-          </w:p>
-        </w:tc>
-      </w:tr>
-      <w:tr>
-        <w:tc>
-          <w:tcPr>
-            <w:tcW w:w="0" w:type="auto"/>
-          </w:tcPr>
-          <w:p>
-            <w:r>
-              <w:t>Procedimiento de referencia / normas internas</w:t>
-            </w:r>
-          </w:p>
-        </w:tc>
-        <w:tc>
-          <w:tcPr>
-            <w:tcW w:w="0" w:type="auto"/>
-          </w:tcPr>
-          <w:p>
-            <w:r>
-              <w:t>7. Documentos relacionados</w:t>
-            </w:r>
-          </w:p>
-        </w:tc>
-        <w:tc>
-          <w:tcPr>
-            <w:tcW w:w="0" w:type="auto"/>
-          </w:tcPr>
-          <w:p>
-            <w:r>
-              <w:t>Copiar todos los PQ, PQA, NI y referencias normativas relacionadas.</w:t>
-            </w:r>
-          </w:p>
-        </w:tc>
-      </w:tr>
-      <w:tr>
-        <w:tc>
-          <w:tcPr>
-            <w:tcW w:w="0" w:type="auto"/>
-          </w:tcPr>
-          <w:p>
-            <w:r>
-              <w:t>Elaboró / Revisó / Aprobó / sectores participantes</w:t>
-            </w:r>
-          </w:p>
-        </w:tc>
-        <w:tc>
-          <w:tcPr>
-            <w:tcW w:w="0" w:type="auto"/>
-          </w:tcPr>
-          <w:p>
-            <w:r>
-              <w:t>5. Responsabilidades</w:t>
-            </w:r>
-          </w:p>
-        </w:tc>
-        <w:tc>
-          <w:tcPr>
-            <w:tcW w:w="0" w:type="auto"/>
-          </w:tcPr>
-          <w:p>
-            <w:r>
-              <w:t>Transformar nombres de sectores/roles en responsabilidades explícitas.</w:t>
-            </w:r>
-          </w:p>
-        </w:tc>
-      </w:tr>
-      <w:tr>
-        <w:tc>
-          <w:tcPr>
-            <w:tcW w:w="0" w:type="auto"/>
-          </w:tcPr>
-          <w:p>
-            <w:r>
-              <w:t>Advertencias, controles, restricciones del proceso</w:t>
-            </w:r>
-          </w:p>
-        </w:tc>
-        <w:tc>
-          <w:tcPr>
-            <w:tcW w:w="0" w:type="auto"/>
-          </w:tcPr>
-          <w:p>
-            <w:r>
-              <w:t>6. Riesgos y controles asociados</w:t>
-            </w:r>
-          </w:p>
-        </w:tc>
-        <w:tc>
-          <w:tcPr>
-            <w:tcW w:w="0" w:type="auto"/>
-          </w:tcPr>
-          <w:p>
-            <w:r>
-              <w:t>Explicitar qué riesgo se evita y qué control impone el procedimiento.</w:t>
-            </w:r>
-          </w:p>
-        </w:tc>
-      </w:tr>
-      <w:tr>
-        <w:tc>
-          <w:tcPr>
-            <w:tcW w:w="0" w:type="auto"/>
-          </w:tcPr>
-          <w:p>
-            <w:r>
-              <w:t>Imágenes, diagramas, flujos, tablas especiales</w:t>
-            </w:r>
-          </w:p>
-        </w:tc>
-        <w:tc>
-          <w:tcPr>
-            <w:tcW w:w="0" w:type="auto"/>
-          </w:tcPr>
-          <w:p>
-            <w:r>
-              <w:t>8. Apéndices o anexos / Desarrollo</w:t>
-            </w:r>
-          </w:p>
-        </w:tc>
-        <w:tc>
-          <w:tcPr>
-            <w:tcW w:w="0" w:type="auto"/>
-          </w:tcPr>
-          <w:p>
-            <w:r>
-              <w:t>Preservar el recurso gráfico o documentar su reemplazo sin perder información.</w:t>
+              <w:t>Mantener trazabilidad histórica y registrar la migración si corresponde.</w:t>
             </w:r>
           </w:p>
         </w:tc>
@@ -518,7 +537,7 @@
         <w:pStyle w:val="Heading1"/>
       </w:pPr>
       <w:r>
-        <w:t>5. Cómo completar secciones nuevas que no existían explícitamente en el original</w:t>
+        <w:t>6. Cómo completar secciones del formato nuevo que no existían de manera explícita en el original</w:t>
       </w:r>
     </w:p>
     <w:p>
@@ -526,7 +545,7 @@
         <w:pStyle w:val="ListParagraph"/>
       </w:pPr>
       <w:r>
-        <w:t>5.1 OBJETIVO: si el original no tenía un apartado “Objetivo” formal, construirlo a partir del título + propósito descrito en la metodología. Debe expresar para qué existe el procedimiento.</w:t>
+        <w:t>6.1 Objetivo: cuando el original no posea un apartado formal de objetivo, debe construirse a partir del propósito operativo real del documento, usando el título, la metodología y el resultado esperado del proceso.</w:t>
       </w:r>
     </w:p>
     <w:p>
@@ -534,7 +553,7 @@
         <w:pStyle w:val="ListParagraph"/>
       </w:pPr>
       <w:r>
-        <w:t>5.2 ALCANCE: se toma de “Área de aplicación” o frases equivalentes. No resumir de más; conservar todas las exclusiones, ejemplos y menciones específicas.</w:t>
+        <w:t>6.2 Alcance: debe derivarse del área de aplicación, del universo afectado, de los sectores involucrados y de cualquier límite o condición de uso expresada en el original.</w:t>
       </w:r>
     </w:p>
     <w:p>
@@ -542,7 +561,7 @@
         <w:pStyle w:val="ListParagraph"/>
       </w:pPr>
       <w:r>
-        <w:t>5.3 DEFINICIONES Y ABREVIATURAS: si el original no tenía este bloque, relevar todas las siglas usadas (IPQ, PQ, PQA, NI, Cal., etc.) y definir al menos las críticas para comprensión y trazabilidad.</w:t>
+        <w:t>6.3 Definiciones y abreviaturas: deben relevarse todas las siglas, códigos, términos técnicos y abreviaturas necesarias para interpretar correctamente el procedimiento.</w:t>
       </w:r>
     </w:p>
     <w:p>
@@ -550,7 +569,7 @@
         <w:pStyle w:val="ListParagraph"/>
       </w:pPr>
       <w:r>
-        <w:t>5.4 RESPONSABILIDADES: si el original solo mostraba “Elaboró / Revisó / Aprobó” o mencionaba sectores dentro de la metodología, convertir eso en responsabilidades explícitas por rol.</w:t>
+        <w:t>6.4 Desarrollo: debe concentrar la lógica operativa completa del original, respetando secuencia, criterios, decisiones, excepciones, controles, registros y condiciones de ejecución.</w:t>
       </w:r>
     </w:p>
     <w:p>
@@ -558,7 +577,7 @@
         <w:pStyle w:val="ListParagraph"/>
       </w:pPr>
       <w:r>
-        <w:t>5.5 RIESGOS Y CONTROLES ASOCIADOS: identificar del procedimiento qué errores busca evitar (ej.: omitir verificaciones, liberar producto no conforme, perder trazabilidad, no registrar resultados) y redactar el control asociado.</w:t>
+        <w:t>6.5 Responsabilidades: deben explicitarse a partir de firmas, roles mencionados, sectores participantes, validadores, aprobadores y ejecutores identificados en el original.</w:t>
       </w:r>
     </w:p>
     <w:p>
@@ -566,7 +585,7 @@
         <w:pStyle w:val="ListParagraph"/>
       </w:pPr>
       <w:r>
-        <w:t>5.6 DOCUMENTOS RELACIONADOS: trasladar sin pérdidas todos los PQ, PQA, NI, formularios, registros y anexos citados. Verificar código exacto y versión cuando exista.</w:t>
+        <w:t>6.6 Riesgos y controles asociados: si el original no tenía este apartado, deben identificarse los riesgos operativos que el procedimiento busca prevenir y el control documental u operativo que los mitiga.</w:t>
       </w:r>
     </w:p>
     <w:p>
@@ -574,7 +593,7 @@
         <w:pStyle w:val="ListParagraph"/>
       </w:pPr>
       <w:r>
-        <w:t>5.7 APÉNDICES O ANEXOS: si el original tiene diagramas, tablas, imágenes, ejemplos de flujo o material gráfico, deben preservarse aquí o quedar incrustados en Desarrollo con referencia clara.</w:t>
+        <w:t>6.7 Documentos relacionados: deben trasladarse todos los procedimientos vinculados, formularios, registros, anexos, normas internas, instructivos y referencias externas citadas en el documento fuente.</w:t>
       </w:r>
     </w:p>
     <w:p>
@@ -582,7 +601,15 @@
         <w:pStyle w:val="ListParagraph"/>
       </w:pPr>
       <w:r>
-        <w:t>5.8 HISTORIAL DE CAMBIOS: migrar todo el “Registro de revisiones” del original. Si el revisado introduce cambios editoriales o estructurales, agregarlos como nueva línea de historial.</w:t>
+        <w:t>6.8 Apéndices o anexos: deben utilizarse para preservar diagramas, flujos, tablas especiales, ejemplos, ilustraciones, formatos auxiliares o cualquier material complementario que no deba perderse.</w:t>
+      </w:r>
+    </w:p>
+    <w:p>
+      <w:pPr>
+        <w:pStyle w:val="ListParagraph"/>
+      </w:pPr>
+      <w:r>
+        <w:t>6.9 Historial de cambios: debe migrarse el registro histórico del original y, si corresponde, agregar la intervención realizada por la migración al formato nuevo.</w:t>
       </w:r>
     </w:p>
     <w:p/>
@@ -591,7 +618,7 @@
         <w:pStyle w:val="Heading1"/>
       </w:pPr>
       <w:r>
-        <w:t>6. Checklist paso a paso de migración</w:t>
+        <w:t>7. Checklist paso a paso de migración</w:t>
       </w:r>
     </w:p>
     <w:p>
@@ -599,7 +626,7 @@
         <w:pStyle w:val="ListParagraph"/>
       </w:pPr>
       <w:r>
-        <w:t>Paso 1 — Identificación del documento: ☐ copiar código IPQ correcto ☐ copiar título correcto ☐ copiar revisión/edición ☐ validar consistencia entre nombre de archivo y encabezado.</w:t>
+        <w:t>Paso 1 — Identificación del documento: ☐ validar código ☐ validar título ☐ validar revisión ☐ validar edición ☐ validar versión de origen.</w:t>
       </w:r>
     </w:p>
     <w:p>
@@ -607,7 +634,7 @@
         <w:pStyle w:val="ListParagraph"/>
       </w:pPr>
       <w:r>
-        <w:t>Paso 2 — Captura del contenido original: ☐ relevar todo el texto del original ☐ relevar tablas ☐ relevar formularios asociados ☐ relevar referencias normativas ☐ relevar imágenes/diagramas ☐ relevar firmas/aprobaciones.</w:t>
+        <w:t>Paso 2 — Lectura integral del original: ☐ leer todo el documento ☐ relevar títulos y subtítulos ☐ relevar tablas ☐ relevar formularios ☐ relevar referencias ☐ relevar gráficos/anexos.</w:t>
       </w:r>
     </w:p>
     <w:p>
@@ -615,7 +642,7 @@
         <w:pStyle w:val="ListParagraph"/>
       </w:pPr>
       <w:r>
-        <w:t>Paso 3 — Carga en template nuevo: ☐ completar Objetivo ☐ completar Alcance ☐ completar Definiciones y abreviaturas ☐ completar Desarrollo ☐ completar Responsabilidades ☐ completar Riesgos y controles ☐ completar Documentos relacionados ☐ completar Apéndices o anexos ☐ completar Historial de cambios.</w:t>
+        <w:t>Paso 3 — Carga estructural en el nuevo formato: ☐ completar Objetivo ☐ completar Alcance ☐ completar Definiciones y abreviaturas ☐ completar Desarrollo ☐ completar Responsabilidades ☐ completar Riesgos y controles ☐ completar Documentos relacionados ☐ completar Apéndices o anexos ☐ completar Historial de cambios.</w:t>
       </w:r>
     </w:p>
     <w:p>
@@ -623,7 +650,7 @@
         <w:pStyle w:val="ListParagraph"/>
       </w:pPr>
       <w:r>
-        <w:t>Paso 4 — Control contra omisiones: ☐ cada formulario del original aparece en el revisado ☐ cada referencia PQ/PQA/NI aparece en el revisado ☐ cada restricción o condición operativa del original aparece en el revisado ☐ cada imagen/diagrama fue migrado o justificado ☐ no se eliminaron actores/roles relevantes ☐ no se acortó el alcance de forma involuntaria.</w:t>
+        <w:t>Paso 4 — Control de trazabilidad: ☐ cada contenido del original quedó ubicado en una sección del nuevo formato ☐ no quedaron fragmentos sin migrar ☐ no se omitieron referencias ni formularios ☐ no se perdieron condiciones especiales del proceso.</w:t>
       </w:r>
     </w:p>
     <w:p>
@@ -631,7 +658,7 @@
         <w:pStyle w:val="ListParagraph"/>
       </w:pPr>
       <w:r>
-        <w:t>Paso 5 — Control de redacción: ☐ no se cambió el sentido técnico ☐ no se agregaron requisitos inexistentes sin marcarlo ☐ no se generalizaron casos específicos ☐ se mantuvieron nombres de formularios y códigos exactos ☐ se corrigieron solo estilo, ortografía y formato cuando correspondía.</w:t>
+        <w:t>Paso 5 — Control técnico: ☐ no cambió el sentido del procedimiento ☐ no se agregaron requisitos no validados ☐ no se eliminaron restricciones importantes ☐ se conservaron códigos y denominaciones correctas.</w:t>
       </w:r>
     </w:p>
     <w:p>
@@ -639,7 +666,7 @@
         <w:pStyle w:val="ListParagraph"/>
       </w:pPr>
       <w:r>
-        <w:t>Paso 6 — Control visual del formato nuevo: ☐ tabla de contenido correcta ☐ numeración de secciones correcta ☐ tablas alineadas ☐ encabezados homogéneos ☐ saltos de página correctos ☐ imágenes legibles ☐ referencias cruzadas revisadas.</w:t>
+        <w:t>Paso 6 — Control visual y documental: ☐ numeración correcta ☐ tabla de contenido correcta ☐ tablas alineadas ☐ encabezados consistentes ☐ anexos legibles ☐ formato homogéneo ☐ saltos de página adecuados.</w:t>
       </w:r>
     </w:p>
     <w:p>
@@ -647,7 +674,7 @@
         <w:pStyle w:val="ListParagraph"/>
       </w:pPr>
       <w:r>
-        <w:t>Paso 7 — Aprobación final: ☐ revisión comparativa original vs revisado ☐ validación por responsable del proceso ☐ guardado de versión final ☐ archivo nombrado según convención ☐ respaldo del original preservado.</w:t>
+        <w:t>Paso 7 — Validación final: ☐ comparación lado a lado entre original y revisado ☐ validación por responsable del proceso ☐ versión final guardada ☐ archivo nombrado según convención vigente ☐ respaldo del original conservado.</w:t>
       </w:r>
     </w:p>
     <w:p/>
@@ -656,7 +683,7 @@
         <w:pStyle w:val="Heading1"/>
       </w:pPr>
       <w:r>
-        <w:t>7. Matriz de control de completitud (usar una fila por documento)</w:t>
+        <w:t>8. Matriz general de control de completitud</w:t>
       </w:r>
     </w:p>
     <w:tbl>
@@ -674,16 +701,17 @@
       </w:tblPr>
       <w:tblGrid>
         <w:gridCol w:w="2200"/>
-        <w:gridCol w:w="900"/>
-        <w:gridCol w:w="900"/>
-        <w:gridCol w:w="900"/>
-        <w:gridCol w:w="900"/>
-        <w:gridCol w:w="1100"/>
+        <w:gridCol w:w="1700"/>
+        <w:gridCol w:w="850"/>
+        <w:gridCol w:w="850"/>
+        <w:gridCol w:w="950"/>
+        <w:gridCol w:w="950"/>
+        <w:gridCol w:w="1200"/>
         <w:gridCol w:w="1500"/>
         <w:gridCol w:w="1300"/>
         <w:gridCol w:w="900"/>
         <w:gridCol w:w="900"/>
-        <w:gridCol w:w="2500"/>
+        <w:gridCol w:w="900"/>
       </w:tblGrid>
       <w:tr>
         <w:tc>
@@ -696,6 +724,19 @@
                 <w:b/>
               </w:rPr>
               <w:t>Documento</w:t>
+            </w:r>
+          </w:p>
+        </w:tc>
+        <w:tc>
+          <w:tcPr>
+            <w:tcW w:w="0" w:type="auto"/>
+          </w:tcPr>
+          <w:p>
+            <w:r>
+              <w:rPr>
+                <w:b/>
+              </w:rPr>
+              <w:t>Código</w:t>
             </w:r>
           </w:p>
         </w:tc>
@@ -825,7 +866,7 @@
               <w:rPr>
                 <w:b/>
               </w:rPr>
-              <w:t>Observaciones</w:t>
+              <w:t>Validado</w:t>
             </w:r>
           </w:p>
         </w:tc>
@@ -837,7 +878,17 @@
           </w:tcPr>
           <w:p>
             <w:r>
-              <w:t>IPQ 7.1.5.01.01</w:t>
+              <w:t>________________</w:t>
+            </w:r>
+          </w:p>
+        </w:tc>
+        <w:tc>
+          <w:tcPr>
+            <w:tcW w:w="0" w:type="auto"/>
+          </w:tcPr>
+          <w:p>
+            <w:r>
+              <w:t>________________</w:t>
             </w:r>
           </w:p>
         </w:tc>
@@ -937,7 +988,7 @@
           </w:tcPr>
           <w:p>
             <w:r>
-              <w:t/>
+              <w:t>☐</w:t>
             </w:r>
           </w:p>
         </w:tc>
@@ -949,7 +1000,17 @@
           </w:tcPr>
           <w:p>
             <w:r>
-              <w:t>IPQ 7.1.5.01.05</w:t>
+              <w:t>________________</w:t>
+            </w:r>
+          </w:p>
+        </w:tc>
+        <w:tc>
+          <w:tcPr>
+            <w:tcW w:w="0" w:type="auto"/>
+          </w:tcPr>
+          <w:p>
+            <w:r>
+              <w:t>________________</w:t>
             </w:r>
           </w:p>
         </w:tc>
@@ -1049,7 +1110,7 @@
           </w:tcPr>
           <w:p>
             <w:r>
-              <w:t/>
+              <w:t>☐</w:t>
             </w:r>
           </w:p>
         </w:tc>
@@ -1061,7 +1122,17 @@
           </w:tcPr>
           <w:p>
             <w:r>
-              <w:t>IPQ 8.3.0.01.04</w:t>
+              <w:t>________________</w:t>
+            </w:r>
+          </w:p>
+        </w:tc>
+        <w:tc>
+          <w:tcPr>
+            <w:tcW w:w="0" w:type="auto"/>
+          </w:tcPr>
+          <w:p>
+            <w:r>
+              <w:t>________________</w:t>
             </w:r>
           </w:p>
         </w:tc>
@@ -1161,7 +1232,7 @@
           </w:tcPr>
           <w:p>
             <w:r>
-              <w:t/>
+              <w:t>☐</w:t>
             </w:r>
           </w:p>
         </w:tc>
@@ -1173,7 +1244,17 @@
           </w:tcPr>
           <w:p>
             <w:r>
-              <w:t>IPQ 8.7.0.01.02</w:t>
+              <w:t>________________</w:t>
+            </w:r>
+          </w:p>
+        </w:tc>
+        <w:tc>
+          <w:tcPr>
+            <w:tcW w:w="0" w:type="auto"/>
+          </w:tcPr>
+          <w:p>
+            <w:r>
+              <w:t>________________</w:t>
             </w:r>
           </w:p>
         </w:tc>
@@ -1273,7 +1354,7 @@
           </w:tcPr>
           <w:p>
             <w:r>
-              <w:t/>
+              <w:t>☐</w:t>
             </w:r>
           </w:p>
         </w:tc>
@@ -1285,7 +1366,17 @@
           </w:tcPr>
           <w:p>
             <w:r>
-              <w:t>Otro documento</w:t>
+              <w:t>________________</w:t>
+            </w:r>
+          </w:p>
+        </w:tc>
+        <w:tc>
+          <w:tcPr>
+            <w:tcW w:w="0" w:type="auto"/>
+          </w:tcPr>
+          <w:p>
+            <w:r>
+              <w:t>________________</w:t>
             </w:r>
           </w:p>
         </w:tc>
@@ -1385,7 +1476,7 @@
           </w:tcPr>
           <w:p>
             <w:r>
-              <w:t/>
+              <w:t>☐</w:t>
             </w:r>
           </w:p>
         </w:tc>
@@ -1397,65 +1488,46 @@
         <w:pStyle w:val="Heading1"/>
       </w:pPr>
       <w:r>
-        <w:t>8. Hallazgos aplicados a los archivos analizados en este repo</w:t>
+        <w:t>9. Criterios para considerar una migración correcta</w:t>
       </w:r>
     </w:p>
     <w:p>
       <w:r>
-        <w:t>IPQ 7.1.5.01.01: el revisado mantiene el tema del plan anual de calibración y verificación, pero debe controlarse especialmente la preservación de referencias como Cal.014a y toda la lista documental asociada.</w:t>
+        <w:t>Una migración se considera correcta solo si el contenido técnico del documento original quedó íntegro, el formato nuevo quedó completo, las referencias se preservaron correctamente, los anexos no se perdieron y las nuevas secciones fueron completadas con criterio verificable.</w:t>
       </w:r>
     </w:p>
     <w:p>
       <w:r>
-        <w:t>IPQ 7.1.5.01.05: el revisado conserva el procedimiento base, pero debe verificarse que no se pierdan referencias como Cal.044 y Cal.031, y que el alcance siga incluyendo herramentales/dispositivos Poka Yoke si corresponde al original.</w:t>
+        <w:t>Toda adaptación de redacción debe mantener la intención técnica original. Los cambios meramente editoriales no deben alterar requisitos, responsabilidades, alcances ni controles.</w:t>
       </w:r>
     </w:p>
     <w:p>
       <w:r>
-        <w:t>IPQ 8.3.0.01.04: es el caso mejor alineado; conservar igualmente tablas, referencias y cualquier componente gráfico del original anterior.</w:t>
+        <w:t>Si existe duda sobre dónde ubicar un contenido del original, debe priorizarse su conservación y dejar registro de criterio aplicado antes que eliminarlo o resumirlo de manera riesgosa.</w:t>
+      </w:r>
+    </w:p>
+    <w:p/>
+    <w:p>
+      <w:pPr>
+        <w:pStyle w:val="Heading1"/>
+      </w:pPr>
+      <w:r>
+        <w:t>10. Reglas de cierre y aprobación</w:t>
       </w:r>
     </w:p>
     <w:p>
       <w:r>
-        <w:t>IPQ 8.7.0.01.02: debe revisarse la conservación de referencias como Cal.006 y Cal.006/1, además de la lógica completa del tratamiento del producto no conforme.</w:t>
-      </w:r>
-    </w:p>
-    <w:p/>
-    <w:p>
-      <w:pPr>
-        <w:pStyle w:val="Heading1"/>
-      </w:pPr>
-      <w:r>
-        <w:t>9. Criterio de aceptación de una migración correcta</w:t>
+        <w:t>Ningún documento migrado debe darse por finalizado sin una revisión comparativa entre versión original y versión migrada.</w:t>
       </w:r>
     </w:p>
     <w:p>
       <w:r>
-        <w:t>Una migración se considera correcta solo si: (a) el contenido técnico del original está íntegro, (b) el nuevo formato está completo, (c) no faltan formularios/referencias/anexos, y (d) cualquier interpretación o síntesis agregada queda documentada y es validable contra el original.</w:t>
-      </w:r>
-    </w:p>
-    <w:p/>
-    <w:p>
-      <w:pPr>
-        <w:pStyle w:val="Heading1"/>
-      </w:pPr>
-      <w:r>
-        <w:t>10. Observaciones finales para el operador</w:t>
+        <w:t>Si una sección del formato nuevo no aplica, debe dejarse expresamente indicado como “No aplica”, con justificación breve. Nunca debe quedar vacía sin explicación.</w:t>
       </w:r>
     </w:p>
     <w:p>
       <w:r>
-        <w:t>Si aparece información en el original que no encaja claramente en una sección del formato nuevo, no eliminarla. Ubicarla en Desarrollo, Documentos relacionados o Apéndices, según corresponda, y dejar nota de trazabilidad.</w:t>
-      </w:r>
-    </w:p>
-    <w:p>
-      <w:r>
-        <w:t>Si una sección del formato nuevo realmente no aplica, escribir “No aplica” con justificación breve. Nunca dejar la sección vacía sin explicación.</w:t>
-      </w:r>
-    </w:p>
-    <w:p>
-      <w:r>
-        <w:t>Antes de cerrar el documento, hacer una lectura paralela original/revisado con una lista de chequeo de códigos, formularios, actores, pasos y restricciones.</w:t>
+        <w:t>La aprobación final debe confirmar que el documento migrado es formalmente correcto y técnicamente equivalente al original, salvo cambios aprobados de manera expresa por la organización.</w:t>
       </w:r>
     </w:p>
     <w:p/>

</xml_diff>

<commit_message>
docs: make migration guide fully generic
</commit_message>
<xml_diff>
--- a/Guia checklist migracion originales a formato nuevo.docx
+++ b/Guia checklist migracion originales a formato nuevo.docx
@@ -7,7 +7,7 @@
         <w:pStyle w:val="Title"/>
       </w:pPr>
       <w:r>
-        <w:t>Guía y checklist general de migración de procedimientos al formato nuevo</w:t>
+        <w:t>Guía general y checklist de migración documental al formato nuevo</w:t>
       </w:r>
     </w:p>
     <w:p>
@@ -15,7 +15,7 @@
         <w:pStyle w:val="Subtitle"/>
       </w:pPr>
       <w:r>
-        <w:t>Documento de uso general para toda la empresa.</w:t>
+        <w:t>Documento corporativo de uso general.</w:t>
       </w:r>
     </w:p>
     <w:p/>
@@ -24,22 +24,36 @@
         <w:pStyle w:val="Heading1"/>
       </w:pPr>
       <w:r>
-        <w:t>1. Objetivo de esta guía</w:t>
+        <w:t>1. Objetivo</w:t>
       </w:r>
     </w:p>
     <w:p>
       <w:r>
-        <w:t>Esta guía define un método general, uniforme y controlable para migrar cualquier procedimiento de la empresa desde un formato anterior al formato documental nuevo estandarizado.</w:t>
+        <w:t>Establecer un método general, uniforme y verificable para migrar documentos desde un formato anterior hacia un formato nuevo estandarizado.</w:t>
       </w:r>
     </w:p>
     <w:p>
       <w:r>
-        <w:t>Su finalidad es asegurar que durante la migración no se omitan pasos, referencias, formularios, responsabilidades, criterios de control, anexos ni información técnica relevante.</w:t>
+        <w:t>Esta guía busca asegurar que durante la migración no se omita contenido, no se altere el sentido técnico del documento y no se pierdan referencias, controles, anexos ni trazabilidad documental.</w:t>
+      </w:r>
+    </w:p>
+    <w:p/>
+    <w:p>
+      <w:pPr>
+        <w:pStyle w:val="Heading1"/>
+      </w:pPr>
+      <w:r>
+        <w:t>2. Alcance</w:t>
       </w:r>
     </w:p>
     <w:p>
       <w:r>
-        <w:t>Debe utilizarse como planilla operativa y checklist de validación para toda migración de procedimientos, instructivos o documentos equivalentes.</w:t>
+        <w:t>Aplica a cualquier documento interno que deba adaptarse a un formato nuevo aprobado por la organización.</w:t>
+      </w:r>
+    </w:p>
+    <w:p>
+      <w:r>
+        <w:t>Debe utilizarse tanto para migraciones simples de formato como para migraciones que requieran reordenamiento estructural del contenido.</w:t>
       </w:r>
     </w:p>
     <w:p/>
@@ -48,17 +62,47 @@
         <w:pStyle w:val="Heading1"/>
       </w:pPr>
       <w:r>
-        <w:t>2. Alcance de aplicación de la guía</w:t>
+        <w:t>3. Principios de migración</w:t>
       </w:r>
     </w:p>
     <w:p>
+      <w:pPr>
+        <w:pStyle w:val="ListParagraph"/>
+      </w:pPr>
       <w:r>
-        <w:t>Aplica a todos los procedimientos, instrucciones, normas internas, documentos operativos y registros documentales que deban migrarse al formato corporativo nuevo.</w:t>
+        <w:t>3.1 La migración debe preservar el contenido sustantivo del documento original.</w:t>
       </w:r>
     </w:p>
     <w:p>
+      <w:pPr>
+        <w:pStyle w:val="ListParagraph"/>
+      </w:pPr>
       <w:r>
-        <w:t>Aplica tanto cuando el documento original esté en formato Word antiguo, Word moderno, PDF editable o cualquier otro formato fuente autorizado dentro de la empresa.</w:t>
+        <w:t>3.2 El cambio de formato no debe introducir omisiones, contradicciones ni simplificaciones riesgosas.</w:t>
+      </w:r>
+    </w:p>
+    <w:p>
+      <w:pPr>
+        <w:pStyle w:val="ListParagraph"/>
+      </w:pPr>
+      <w:r>
+        <w:t>3.3 Si el formato nuevo contiene secciones que no estaban explícitas en el documento original, esas secciones deben completarse a partir del contenido disponible y con criterio documental consistente.</w:t>
+      </w:r>
+    </w:p>
+    <w:p>
+      <w:pPr>
+        <w:pStyle w:val="ListParagraph"/>
+      </w:pPr>
+      <w:r>
+        <w:t>3.4 Si una sección del formato nuevo no corresponde al documento migrado, debe indicarse expresamente “No aplica” con una justificación breve.</w:t>
+      </w:r>
+    </w:p>
+    <w:p>
+      <w:pPr>
+        <w:pStyle w:val="ListParagraph"/>
+      </w:pPr>
+      <w:r>
+        <w:t>3.5 Toda migración debe poder ser auditada y trazada contra el documento de origen.</w:t>
       </w:r>
     </w:p>
     <w:p/>
@@ -67,22 +111,55 @@
         <w:pStyle w:val="Heading1"/>
       </w:pPr>
       <w:r>
-        <w:t>3. Principio rector de migración</w:t>
+        <w:t>4. Preparación previa</w:t>
       </w:r>
     </w:p>
     <w:p>
+      <w:pPr>
+        <w:pStyle w:val="ListParagraph"/>
+      </w:pPr>
       <w:r>
-        <w:t>La migración no debe ser una reescritura libre ni una simplificación del documento original.</w:t>
+        <w:t>☐ Confirmar cuál es el documento de origen autorizado para migrar.</w:t>
       </w:r>
     </w:p>
     <w:p>
+      <w:pPr>
+        <w:pStyle w:val="ListParagraph"/>
+      </w:pPr>
       <w:r>
-        <w:t>Todo contenido técnico, operativo, normativo o documental del archivo original debe preservarse y quedar correctamente ubicado dentro de la nueva estructura.</w:t>
+        <w:t>☐ Confirmar cuál es el formato nuevo aprobado que se utilizará como destino.</w:t>
       </w:r>
     </w:p>
     <w:p>
+      <w:pPr>
+        <w:pStyle w:val="ListParagraph"/>
+      </w:pPr>
       <w:r>
-        <w:t>Si el formato nuevo exige apartados que el original no tenía explícitamente, esos apartados deben completarse usando la información implícita del documento fuente, criterios documentales consistentes y validación técnica interna. Nunca deben omitirse silenciosamente.</w:t>
+        <w:t>☐ Crear una copia de trabajo del formato nuevo antes de editar.</w:t>
+      </w:r>
+    </w:p>
+    <w:p>
+      <w:pPr>
+        <w:pStyle w:val="ListParagraph"/>
+      </w:pPr>
+      <w:r>
+        <w:t>☐ Leer el documento original de forma completa antes de comenzar la migración.</w:t>
+      </w:r>
+    </w:p>
+    <w:p>
+      <w:pPr>
+        <w:pStyle w:val="ListParagraph"/>
+      </w:pPr>
+      <w:r>
+        <w:t>☐ Relevar texto, tablas, anexos, referencias, notas, gráficos, firmas y metadatos relevantes.</w:t>
+      </w:r>
+    </w:p>
+    <w:p>
+      <w:pPr>
+        <w:pStyle w:val="ListParagraph"/>
+      </w:pPr>
+      <w:r>
+        <w:t>☐ Registrar responsable y fecha de la migración.</w:t>
       </w:r>
     </w:p>
     <w:p/>
@@ -91,64 +168,7 @@
         <w:pStyle w:val="Heading1"/>
       </w:pPr>
       <w:r>
-        <w:t>4. Preparación previa obligatoria</w:t>
-      </w:r>
-    </w:p>
-    <w:p>
-      <w:pPr>
-        <w:pStyle w:val="ListParagraph"/>
-      </w:pPr>
-      <w:r>
-        <w:t>☐ Identificar código, título, revisión, edición y estado vigente del documento original.</w:t>
-      </w:r>
-    </w:p>
-    <w:p>
-      <w:pPr>
-        <w:pStyle w:val="ListParagraph"/>
-      </w:pPr>
-      <w:r>
-        <w:t>☐ Verificar que el archivo fuente sea la última versión aprobada o la versión autorizada para migrar.</w:t>
-      </w:r>
-    </w:p>
-    <w:p>
-      <w:pPr>
-        <w:pStyle w:val="ListParagraph"/>
-      </w:pPr>
-      <w:r>
-        <w:t>☐ Confirmar cuál es el template nuevo aprobado por la empresa para usar como destino.</w:t>
-      </w:r>
-    </w:p>
-    <w:p>
-      <w:pPr>
-        <w:pStyle w:val="ListParagraph"/>
-      </w:pPr>
-      <w:r>
-        <w:t>☐ Crear copia de trabajo del template antes de comenzar la edición.</w:t>
-      </w:r>
-    </w:p>
-    <w:p>
-      <w:pPr>
-        <w:pStyle w:val="ListParagraph"/>
-      </w:pPr>
-      <w:r>
-        <w:t>☐ Relevar del original todo el contenido textual, tablas, formularios, referencias, gráficos, diagramas, firmas, responsables y notas asociadas.</w:t>
-      </w:r>
-    </w:p>
-    <w:p>
-      <w:pPr>
-        <w:pStyle w:val="ListParagraph"/>
-      </w:pPr>
-      <w:r>
-        <w:t>☐ Registrar responsable de la migración, fecha y documento intervenido.</w:t>
-      </w:r>
-    </w:p>
-    <w:p/>
-    <w:p>
-      <w:pPr>
-        <w:pStyle w:val="Heading1"/>
-      </w:pPr>
-      <w:r>
-        <w:t>5. Mapeo general: contenido del original hacia el formato nuevo</w:t>
+        <w:t>5. Mapeo general de contenido</w:t>
       </w:r>
     </w:p>
     <w:tbl>
@@ -179,7 +199,7 @@
               <w:rPr>
                 <w:b/>
               </w:rPr>
-              <w:t>Contenido ubicado en el original</w:t>
+              <w:t>Contenido del documento original</w:t>
             </w:r>
           </w:p>
         </w:tc>
@@ -205,22 +225,12 @@
               <w:rPr>
                 <w:b/>
               </w:rPr>
-              <w:t>Criterio de aplicación</w:t>
+              <w:t>Criterio de migración</w:t>
             </w:r>
           </w:p>
         </w:tc>
       </w:tr>
       <w:tr>
-        <w:tc>
-          <w:tcPr>
-            <w:tcW w:w="0" w:type="auto"/>
-          </w:tcPr>
-          <w:p>
-            <w:r>
-              <w:t>Título / encabezado / identificación</w:t>
-            </w:r>
-          </w:p>
-        </w:tc>
         <w:tc>
           <w:tcPr>
             <w:tcW w:w="0" w:type="auto"/>
@@ -237,7 +247,17 @@
           </w:tcPr>
           <w:p>
             <w:r>
-              <w:t>Conservar denominación funcional, código y datos de versión.</w:t>
+              <w:t>Identificación en formato nuevo</w:t>
+            </w:r>
+          </w:p>
+        </w:tc>
+        <w:tc>
+          <w:tcPr>
+            <w:tcW w:w="0" w:type="auto"/>
+          </w:tcPr>
+          <w:p>
+            <w:r>
+              <w:t>Conservar datos clave de identificación y versión.</w:t>
             </w:r>
           </w:p>
         </w:tc>
@@ -249,7 +269,7 @@
           </w:tcPr>
           <w:p>
             <w:r>
-              <w:t>Objeto o finalidad implícita</w:t>
+              <w:t>Finalidad o propósito del documento</w:t>
             </w:r>
           </w:p>
         </w:tc>
@@ -259,7 +279,7 @@
           </w:tcPr>
           <w:p>
             <w:r>
-              <w:t>1. Objetivo</w:t>
+              <w:t>Objetivo</w:t>
             </w:r>
           </w:p>
         </w:tc>
@@ -269,7 +289,7 @@
           </w:tcPr>
           <w:p>
             <w:r>
-              <w:t>Formalizar el propósito técnico del procedimiento sin cambiar su sentido.</w:t>
+              <w:t>Expresar con claridad para qué existe el documento.</w:t>
             </w:r>
           </w:p>
         </w:tc>
@@ -281,7 +301,7 @@
           </w:tcPr>
           <w:p>
             <w:r>
-              <w:t>Área de aplicación / universo afectado</w:t>
+              <w:t>Ámbito de aplicación</w:t>
             </w:r>
           </w:p>
         </w:tc>
@@ -291,7 +311,7 @@
           </w:tcPr>
           <w:p>
             <w:r>
-              <w:t>2. Alcance</w:t>
+              <w:t>Alcance</w:t>
             </w:r>
           </w:p>
         </w:tc>
@@ -301,7 +321,7 @@
           </w:tcPr>
           <w:p>
             <w:r>
-              <w:t>Trasladar el alcance completo, incluyendo límites, exclusiones y casos particulares.</w:t>
+              <w:t>Mantener límites, condiciones y universo de aplicación.</w:t>
             </w:r>
           </w:p>
         </w:tc>
@@ -313,7 +333,7 @@
           </w:tcPr>
           <w:p>
             <w:r>
-              <w:t>Definiciones dispersas o siglas usadas</w:t>
+              <w:t>Terminología, siglas o conceptos clave</w:t>
             </w:r>
           </w:p>
         </w:tc>
@@ -323,7 +343,7 @@
           </w:tcPr>
           <w:p>
             <w:r>
-              <w:t>3. Definiciones y abreviaturas</w:t>
+              <w:t>Definiciones y abreviaturas</w:t>
             </w:r>
           </w:p>
         </w:tc>
@@ -333,7 +353,7 @@
           </w:tcPr>
           <w:p>
             <w:r>
-              <w:t>Reunir y normalizar terminología necesaria para comprensión y trazabilidad.</w:t>
+              <w:t>Reunir términos necesarios para comprensión uniforme.</w:t>
             </w:r>
           </w:p>
         </w:tc>
@@ -345,7 +365,7 @@
           </w:tcPr>
           <w:p>
             <w:r>
-              <w:t>Metodología / instrucciones / operatoria</w:t>
+              <w:t>Contenido operativo principal</w:t>
             </w:r>
           </w:p>
         </w:tc>
@@ -355,7 +375,7 @@
           </w:tcPr>
           <w:p>
             <w:r>
-              <w:t>4. Desarrollo</w:t>
+              <w:t>Desarrollo</w:t>
             </w:r>
           </w:p>
         </w:tc>
@@ -365,7 +385,7 @@
           </w:tcPr>
           <w:p>
             <w:r>
-              <w:t>Migrar todos los pasos, secuencias, decisiones, validaciones y controles.</w:t>
+              <w:t>Preservar secuencia, lógica y condiciones del contenido.</w:t>
             </w:r>
           </w:p>
         </w:tc>
@@ -377,7 +397,7 @@
           </w:tcPr>
           <w:p>
             <w:r>
-              <w:t>Firmas / sectores / actores intervinientes</w:t>
+              <w:t>Roles, intervenciones o aprobaciones</w:t>
             </w:r>
           </w:p>
         </w:tc>
@@ -387,7 +407,7 @@
           </w:tcPr>
           <w:p>
             <w:r>
-              <w:t>5. Responsabilidades</w:t>
+              <w:t>Responsabilidades</w:t>
             </w:r>
           </w:p>
         </w:tc>
@@ -397,7 +417,7 @@
           </w:tcPr>
           <w:p>
             <w:r>
-              <w:t>Convertir participantes y roles del original en responsabilidades explícitas.</w:t>
+              <w:t>Hacer explícitos los roles o funciones involucradas.</w:t>
             </w:r>
           </w:p>
         </w:tc>
@@ -409,7 +429,7 @@
           </w:tcPr>
           <w:p>
             <w:r>
-              <w:t>Advertencias / puntos de control / riesgos implícitos</w:t>
+              <w:t>Controles, advertencias o condiciones críticas</w:t>
             </w:r>
           </w:p>
         </w:tc>
@@ -419,7 +439,7 @@
           </w:tcPr>
           <w:p>
             <w:r>
-              <w:t>6. Riesgos y controles asociados</w:t>
+              <w:t>Riesgos y controles asociados</w:t>
             </w:r>
           </w:p>
         </w:tc>
@@ -429,7 +449,7 @@
           </w:tcPr>
           <w:p>
             <w:r>
-              <w:t>Explicitar qué riesgo existe y qué control lo previene o detecta.</w:t>
+              <w:t>Explicitar riesgos prevenidos y controles aplicados.</w:t>
             </w:r>
           </w:p>
         </w:tc>
@@ -441,7 +461,7 @@
           </w:tcPr>
           <w:p>
             <w:r>
-              <w:t>Procedimientos, formularios, normas, registros relacionados</w:t>
+              <w:t>Referencias, registros o documentos vinculados</w:t>
             </w:r>
           </w:p>
         </w:tc>
@@ -451,7 +471,7 @@
           </w:tcPr>
           <w:p>
             <w:r>
-              <w:t>7. Documentos relacionados</w:t>
+              <w:t>Documentos relacionados</w:t>
             </w:r>
           </w:p>
         </w:tc>
@@ -461,7 +481,7 @@
           </w:tcPr>
           <w:p>
             <w:r>
-              <w:t>Copiar todos los documentos citados con sus códigos y nombres correctos.</w:t>
+              <w:t>Mantener trazabilidad documental completa.</w:t>
             </w:r>
           </w:p>
         </w:tc>
@@ -473,7 +493,7 @@
           </w:tcPr>
           <w:p>
             <w:r>
-              <w:t>Gráficos, flujos, tablas especiales, ejemplos, material de apoyo</w:t>
+              <w:t>Material complementario</w:t>
             </w:r>
           </w:p>
         </w:tc>
@@ -483,7 +503,7 @@
           </w:tcPr>
           <w:p>
             <w:r>
-              <w:t>8. Apéndices o anexos</w:t>
+              <w:t>Apéndices o anexos</w:t>
             </w:r>
           </w:p>
         </w:tc>
@@ -493,7 +513,7 @@
           </w:tcPr>
           <w:p>
             <w:r>
-              <w:t>Preservar material complementario o justificar su incorporación dentro del desarrollo.</w:t>
+              <w:t>Conservar tablas especiales, gráficos o material de apoyo.</w:t>
             </w:r>
           </w:p>
         </w:tc>
@@ -505,7 +525,7 @@
           </w:tcPr>
           <w:p>
             <w:r>
-              <w:t>Registro de revisiones / historial</w:t>
+              <w:t>Registro histórico de cambios</w:t>
             </w:r>
           </w:p>
         </w:tc>
@@ -515,7 +535,7 @@
           </w:tcPr>
           <w:p>
             <w:r>
-              <w:t>9. Historial de cambios</w:t>
+              <w:t>Historial de cambios</w:t>
             </w:r>
           </w:p>
         </w:tc>
@@ -525,7 +545,7 @@
           </w:tcPr>
           <w:p>
             <w:r>
-              <w:t>Mantener trazabilidad histórica y registrar la migración si corresponde.</w:t>
+              <w:t>Mantener continuidad documental y trazabilidad de revisiones.</w:t>
             </w:r>
           </w:p>
         </w:tc>
@@ -537,7 +557,7 @@
         <w:pStyle w:val="Heading1"/>
       </w:pPr>
       <w:r>
-        <w:t>6. Cómo completar secciones del formato nuevo que no existían de manera explícita en el original</w:t>
+        <w:t>6. Criterio para completar secciones nuevas</w:t>
       </w:r>
     </w:p>
     <w:p>
@@ -545,7 +565,7 @@
         <w:pStyle w:val="ListParagraph"/>
       </w:pPr>
       <w:r>
-        <w:t>6.1 Objetivo: cuando el original no posea un apartado formal de objetivo, debe construirse a partir del propósito operativo real del documento, usando el título, la metodología y el resultado esperado del proceso.</w:t>
+        <w:t>6.1 Si el formato nuevo incorpora una sección que el documento original no presentaba con ese nombre, se debe ubicar allí el contenido equivalente o implícito que exista en el original.</w:t>
       </w:r>
     </w:p>
     <w:p>
@@ -553,7 +573,7 @@
         <w:pStyle w:val="ListParagraph"/>
       </w:pPr>
       <w:r>
-        <w:t>6.2 Alcance: debe derivarse del área de aplicación, del universo afectado, de los sectores involucrados y de cualquier límite o condición de uso expresada en el original.</w:t>
+        <w:t>6.2 Si la información necesaria está distribuida en varios apartados del documento original, debe consolidarse sin alterar su significado.</w:t>
       </w:r>
     </w:p>
     <w:p>
@@ -561,7 +581,7 @@
         <w:pStyle w:val="ListParagraph"/>
       </w:pPr>
       <w:r>
-        <w:t>6.3 Definiciones y abreviaturas: deben relevarse todas las siglas, códigos, términos técnicos y abreviaturas necesarias para interpretar correctamente el procedimiento.</w:t>
+        <w:t>6.3 Si la sección nueva requiere una formulación más explícita que la del documento original, puede reescribirse con estilo más claro siempre que no cambie el alcance, la exigencia ni la intención técnica.</w:t>
       </w:r>
     </w:p>
     <w:p>
@@ -569,47 +589,7 @@
         <w:pStyle w:val="ListParagraph"/>
       </w:pPr>
       <w:r>
-        <w:t>6.4 Desarrollo: debe concentrar la lógica operativa completa del original, respetando secuencia, criterios, decisiones, excepciones, controles, registros y condiciones de ejecución.</w:t>
-      </w:r>
-    </w:p>
-    <w:p>
-      <w:pPr>
-        <w:pStyle w:val="ListParagraph"/>
-      </w:pPr>
-      <w:r>
-        <w:t>6.5 Responsabilidades: deben explicitarse a partir de firmas, roles mencionados, sectores participantes, validadores, aprobadores y ejecutores identificados en el original.</w:t>
-      </w:r>
-    </w:p>
-    <w:p>
-      <w:pPr>
-        <w:pStyle w:val="ListParagraph"/>
-      </w:pPr>
-      <w:r>
-        <w:t>6.6 Riesgos y controles asociados: si el original no tenía este apartado, deben identificarse los riesgos operativos que el procedimiento busca prevenir y el control documental u operativo que los mitiga.</w:t>
-      </w:r>
-    </w:p>
-    <w:p>
-      <w:pPr>
-        <w:pStyle w:val="ListParagraph"/>
-      </w:pPr>
-      <w:r>
-        <w:t>6.7 Documentos relacionados: deben trasladarse todos los procedimientos vinculados, formularios, registros, anexos, normas internas, instructivos y referencias externas citadas en el documento fuente.</w:t>
-      </w:r>
-    </w:p>
-    <w:p>
-      <w:pPr>
-        <w:pStyle w:val="ListParagraph"/>
-      </w:pPr>
-      <w:r>
-        <w:t>6.8 Apéndices o anexos: deben utilizarse para preservar diagramas, flujos, tablas especiales, ejemplos, ilustraciones, formatos auxiliares o cualquier material complementario que no deba perderse.</w:t>
-      </w:r>
-    </w:p>
-    <w:p>
-      <w:pPr>
-        <w:pStyle w:val="ListParagraph"/>
-      </w:pPr>
-      <w:r>
-        <w:t>6.9 Historial de cambios: debe migrarse el registro histórico del original y, si corresponde, agregar la intervención realizada por la migración al formato nuevo.</w:t>
+        <w:t>6.4 Si no existe información suficiente para completar una sección nueva, debe dejarse constancia de ello y gestionarse validación antes de cerrar la migración.</w:t>
       </w:r>
     </w:p>
     <w:p/>
@@ -618,7 +598,7 @@
         <w:pStyle w:val="Heading1"/>
       </w:pPr>
       <w:r>
-        <w:t>7. Checklist paso a paso de migración</w:t>
+        <w:t>7. Checklist paso a paso</w:t>
       </w:r>
     </w:p>
     <w:p>
@@ -626,7 +606,7 @@
         <w:pStyle w:val="ListParagraph"/>
       </w:pPr>
       <w:r>
-        <w:t>Paso 1 — Identificación del documento: ☐ validar código ☐ validar título ☐ validar revisión ☐ validar edición ☐ validar versión de origen.</w:t>
+        <w:t>Paso 1 — Identificación: ☐ validar nombre del documento ☐ validar código o identificador ☐ validar revisión o versión ☐ validar vigencia.</w:t>
       </w:r>
     </w:p>
     <w:p>
@@ -634,7 +614,7 @@
         <w:pStyle w:val="ListParagraph"/>
       </w:pPr>
       <w:r>
-        <w:t>Paso 2 — Lectura integral del original: ☐ leer todo el documento ☐ relevar títulos y subtítulos ☐ relevar tablas ☐ relevar formularios ☐ relevar referencias ☐ relevar gráficos/anexos.</w:t>
+        <w:t>Paso 2 — Relevamiento: ☐ identificar títulos y subtítulos ☐ identificar secuencia de contenido ☐ identificar tablas ☐ identificar referencias cruzadas ☐ identificar anexos o adjuntos ☐ identificar aprobaciones o responsables.</w:t>
       </w:r>
     </w:p>
     <w:p>
@@ -642,7 +622,7 @@
         <w:pStyle w:val="ListParagraph"/>
       </w:pPr>
       <w:r>
-        <w:t>Paso 3 — Carga estructural en el nuevo formato: ☐ completar Objetivo ☐ completar Alcance ☐ completar Definiciones y abreviaturas ☐ completar Desarrollo ☐ completar Responsabilidades ☐ completar Riesgos y controles ☐ completar Documentos relacionados ☐ completar Apéndices o anexos ☐ completar Historial de cambios.</w:t>
+        <w:t>Paso 3 — Traslado al formato nuevo: ☐ completar todas las secciones obligatorias ☐ ubicar cada contenido del original dentro de la nueva estructura ☐ conservar denominaciones, referencias y datos críticos.</w:t>
       </w:r>
     </w:p>
     <w:p>
@@ -650,7 +630,7 @@
         <w:pStyle w:val="ListParagraph"/>
       </w:pPr>
       <w:r>
-        <w:t>Paso 4 — Control de trazabilidad: ☐ cada contenido del original quedó ubicado en una sección del nuevo formato ☐ no quedaron fragmentos sin migrar ☐ no se omitieron referencias ni formularios ☐ no se perdieron condiciones especiales del proceso.</w:t>
+        <w:t>Paso 4 — Control de integridad: ☐ verificar que no falte contenido ☐ verificar que no sobren interpretaciones no autorizadas ☐ verificar que no se haya resumido de manera inadecuada ☐ verificar que anexos y tablas sigan siendo legibles.</w:t>
       </w:r>
     </w:p>
     <w:p>
@@ -658,7 +638,7 @@
         <w:pStyle w:val="ListParagraph"/>
       </w:pPr>
       <w:r>
-        <w:t>Paso 5 — Control técnico: ☐ no cambió el sentido del procedimiento ☐ no se agregaron requisitos no validados ☐ no se eliminaron restricciones importantes ☐ se conservaron códigos y denominaciones correctas.</w:t>
+        <w:t>Paso 5 — Control técnico y documental: ☐ validar consistencia interna ☐ validar numeración ☐ validar títulos ☐ validar formato visual ☐ validar trazabilidad contra el original.</w:t>
       </w:r>
     </w:p>
     <w:p>
@@ -666,15 +646,7 @@
         <w:pStyle w:val="ListParagraph"/>
       </w:pPr>
       <w:r>
-        <w:t>Paso 6 — Control visual y documental: ☐ numeración correcta ☐ tabla de contenido correcta ☐ tablas alineadas ☐ encabezados consistentes ☐ anexos legibles ☐ formato homogéneo ☐ saltos de página adecuados.</w:t>
-      </w:r>
-    </w:p>
-    <w:p>
-      <w:pPr>
-        <w:pStyle w:val="ListParagraph"/>
-      </w:pPr>
-      <w:r>
-        <w:t>Paso 7 — Validación final: ☐ comparación lado a lado entre original y revisado ☐ validación por responsable del proceso ☐ versión final guardada ☐ archivo nombrado según convención vigente ☐ respaldo del original conservado.</w:t>
+        <w:t>Paso 6 — Cierre: ☐ revisión final comparativa ☐ aprobación según circuito interno ☐ guardado final ☐ resguardo de versión de origen.</w:t>
       </w:r>
     </w:p>
     <w:p/>
@@ -683,7 +655,7 @@
         <w:pStyle w:val="Heading1"/>
       </w:pPr>
       <w:r>
-        <w:t>8. Matriz general de control de completitud</w:t>
+        <w:t>8. Matriz de control de completitud</w:t>
       </w:r>
     </w:p>
     <w:tbl>
@@ -700,8 +672,8 @@
         </w:tblBorders>
       </w:tblPr>
       <w:tblGrid>
-        <w:gridCol w:w="2200"/>
-        <w:gridCol w:w="1700"/>
+        <w:gridCol w:w="2400"/>
+        <w:gridCol w:w="1100"/>
         <w:gridCol w:w="850"/>
         <w:gridCol w:w="850"/>
         <w:gridCol w:w="950"/>
@@ -736,7 +708,7 @@
               <w:rPr>
                 <w:b/>
               </w:rPr>
-              <w:t>Código</w:t>
+              <w:t>Identificación</w:t>
             </w:r>
           </w:p>
         </w:tc>
@@ -888,7 +860,7 @@
           </w:tcPr>
           <w:p>
             <w:r>
-              <w:t>________________</w:t>
+              <w:t>☐</w:t>
             </w:r>
           </w:p>
         </w:tc>
@@ -1010,7 +982,7 @@
           </w:tcPr>
           <w:p>
             <w:r>
-              <w:t>________________</w:t>
+              <w:t>☐</w:t>
             </w:r>
           </w:p>
         </w:tc>
@@ -1132,7 +1104,7 @@
           </w:tcPr>
           <w:p>
             <w:r>
-              <w:t>________________</w:t>
+              <w:t>☐</w:t>
             </w:r>
           </w:p>
         </w:tc>
@@ -1254,7 +1226,7 @@
           </w:tcPr>
           <w:p>
             <w:r>
-              <w:t>________________</w:t>
+              <w:t>☐</w:t>
             </w:r>
           </w:p>
         </w:tc>
@@ -1376,7 +1348,7 @@
           </w:tcPr>
           <w:p>
             <w:r>
-              <w:t>________________</w:t>
+              <w:t>☐</w:t>
             </w:r>
           </w:p>
         </w:tc>
@@ -1488,46 +1460,36 @@
         <w:pStyle w:val="Heading1"/>
       </w:pPr>
       <w:r>
-        <w:t>9. Criterios para considerar una migración correcta</w:t>
+        <w:t>9. Criterios de aceptación</w:t>
       </w:r>
     </w:p>
     <w:p>
       <w:r>
-        <w:t>Una migración se considera correcta solo si el contenido técnico del documento original quedó íntegro, el formato nuevo quedó completo, las referencias se preservaron correctamente, los anexos no se perdieron y las nuevas secciones fueron completadas con criterio verificable.</w:t>
+        <w:t>Una migración se considera correcta cuando el contenido del documento original permanece íntegro, el formato nuevo queda completo, la información se puede rastrear con claridad y no existen omisiones ni alteraciones sustanciales no justificadas.</w:t>
       </w:r>
     </w:p>
     <w:p>
       <w:r>
-        <w:t>Toda adaptación de redacción debe mantener la intención técnica original. Los cambios meramente editoriales no deben alterar requisitos, responsabilidades, alcances ni controles.</w:t>
+        <w:t>La calidad de la migración debe evaluarse tanto por su corrección formal como por su fidelidad técnica respecto del documento de origen.</w:t>
+      </w:r>
+    </w:p>
+    <w:p/>
+    <w:p>
+      <w:pPr>
+        <w:pStyle w:val="Heading1"/>
+      </w:pPr>
+      <w:r>
+        <w:t>10. Revisión final obligatoria</w:t>
       </w:r>
     </w:p>
     <w:p>
       <w:r>
-        <w:t>Si existe duda sobre dónde ubicar un contenido del original, debe priorizarse su conservación y dejar registro de criterio aplicado antes que eliminarlo o resumirlo de manera riesgosa.</w:t>
-      </w:r>
-    </w:p>
-    <w:p/>
-    <w:p>
-      <w:pPr>
-        <w:pStyle w:val="Heading1"/>
-      </w:pPr>
-      <w:r>
-        <w:t>10. Reglas de cierre y aprobación</w:t>
+        <w:t>Antes de aprobar la versión migrada, debe realizarse una comparación final entre el documento original y el documento migrado.</w:t>
       </w:r>
     </w:p>
     <w:p>
       <w:r>
-        <w:t>Ningún documento migrado debe darse por finalizado sin una revisión comparativa entre versión original y versión migrada.</w:t>
-      </w:r>
-    </w:p>
-    <w:p>
-      <w:r>
-        <w:t>Si una sección del formato nuevo no aplica, debe dejarse expresamente indicado como “No aplica”, con justificación breve. Nunca debe quedar vacía sin explicación.</w:t>
-      </w:r>
-    </w:p>
-    <w:p>
-      <w:r>
-        <w:t>La aprobación final debe confirmar que el documento migrado es formalmente correcto y técnicamente equivalente al original, salvo cambios aprobados de manera expresa por la organización.</w:t>
+        <w:t>Esa revisión debe confirmar que todos los apartados relevantes fueron contemplados, que las secciones nuevas fueron completadas con criterio válido y que el resultado final cumple el estándar documental esperado.</w:t>
       </w:r>
     </w:p>
     <w:p/>

</xml_diff>